<commit_message>
docs(feature-gaps): mark language work built; widen schema.sql drift note
- ⊕ N1 (language control) moves from open to built: the save-bug fix, the
  account-wide setting and the onboarding capture all landed in d41b31f.
  Records the two founder actions still outstanding — apply APPLY_0020.sql
  before the code deploys, since provision_hotel is now called with a locale
  the database won't accept until then.
- ⊕ 26 (schema.sql rebuild risk) was understated: the blueprint is missing
  0011, 0015, 0017, 0018, 0019 and 0020, not just 0011. Task prompt updated
  to fold all six in, blueprint-only.

Co-Authored-By: Claude Opus 5 <noreply@anthropic.com>
</commit_message>
<xml_diff>
--- a/FEATURE_GAPS.docx
+++ b/FEATURE_GAPS.docx
@@ -1279,7 +1279,7 @@
               <w:jc w:val="left"/>
             </w:pPr>
             <w:r>
-              <w:t xml:space="preserve">🔴 open</w:t>
+              <w:t xml:space="preserve">🟠 built (save-bug fix + account language + onboarding); needs migration 0020 + deploy</w:t>
             </w:r>
           </w:p>
         </w:tc>
@@ -3510,6 +3510,247 @@
     <w:p>
       <w:pPr>
         <w:pStyle w:val="FirstParagraph"/>
+      </w:pPr>
+      <w:r>
+        <w:rPr>
+          <w:bCs/>
+          <w:b/>
+        </w:rPr>
+        <w:t xml:space="preserve">Status (28 Aug): ✅ both built, building clean — pending migration + deploy.</w:t>
+      </w:r>
+      <w:r>
+        <w:t xml:space="preserve"> </w:t>
+      </w:r>
+      <w:r>
+        <w:t xml:space="preserve">Prompt A found the real cause of the save bug (React 19 resets an uncontrolled</w:t>
+      </w:r>
+      <w:r>
+        <w:t xml:space="preserve"> </w:t>
+      </w:r>
+      <w:r>
+        <w:rPr>
+          <w:rStyle w:val="VerbatimChar"/>
+        </w:rPr>
+        <w:t xml:space="preserve">&lt;select&gt;</w:t>
+      </w:r>
+      <w:r>
+        <w:t xml:space="preserve"> </w:t>
+      </w:r>
+      <w:r>
+        <w:t xml:space="preserve">after a server action, snapping it back to English) and fixed it with a controlled +</w:t>
+      </w:r>
+      <w:r>
+        <w:t xml:space="preserve"> </w:t>
+      </w:r>
+      <w:r>
+        <w:rPr>
+          <w:rStyle w:val="VerbatimChar"/>
+        </w:rPr>
+        <w:t xml:space="preserve">startTransition</w:t>
+      </w:r>
+      <w:r>
+        <w:t xml:space="preserve"> </w:t>
+      </w:r>
+      <w:r>
+        <w:t xml:space="preserve">pattern. Prompt B added the</w:t>
+      </w:r>
+      <w:r>
+        <w:t xml:space="preserve"> </w:t>
+      </w:r>
+      <w:r>
+        <w:rPr>
+          <w:bCs/>
+          <w:b/>
+        </w:rPr>
+        <w:t xml:space="preserve">Account language</w:t>
+      </w:r>
+      <w:r>
+        <w:t xml:space="preserve"> </w:t>
+      </w:r>
+      <w:r>
+        <w:t xml:space="preserve">setting (Settings + onboarding), migration</w:t>
+      </w:r>
+      <w:r>
+        <w:t xml:space="preserve"> </w:t>
+      </w:r>
+      <w:r>
+        <w:rPr>
+          <w:bCs/>
+          <w:b/>
+        </w:rPr>
+        <w:t xml:space="preserve">0020</w:t>
+      </w:r>
+      <w:r>
+        <w:t xml:space="preserve"> </w:t>
+      </w:r>
+      <w:r>
+        <w:t xml:space="preserve">(</w:t>
+      </w:r>
+      <w:r>
+        <w:rPr>
+          <w:rStyle w:val="VerbatimChar"/>
+        </w:rPr>
+        <w:t xml:space="preserve">hotel_settings.default_locale</w:t>
+      </w:r>
+      <w:r>
+        <w:t xml:space="preserve">). The model: one seed (account language) feeds two consumers — at</w:t>
+      </w:r>
+      <w:r>
+        <w:t xml:space="preserve"> </w:t>
+      </w:r>
+      <w:r>
+        <w:rPr>
+          <w:bCs/>
+          <w:b/>
+        </w:rPr>
+        <w:t xml:space="preserve">onboarding</w:t>
+      </w:r>
+      <w:r>
+        <w:t xml:space="preserve"> </w:t>
+      </w:r>
+      <w:r>
+        <w:t xml:space="preserve">it sets both</w:t>
+      </w:r>
+      <w:r>
+        <w:t xml:space="preserve"> </w:t>
+      </w:r>
+      <w:r>
+        <w:rPr>
+          <w:rStyle w:val="VerbatimChar"/>
+        </w:rPr>
+        <w:t xml:space="preserve">default_locale</w:t>
+      </w:r>
+      <w:r>
+        <w:t xml:space="preserve"> </w:t>
+      </w:r>
+      <w:r>
+        <w:t xml:space="preserve">and</w:t>
+      </w:r>
+      <w:r>
+        <w:t xml:space="preserve"> </w:t>
+      </w:r>
+      <w:r>
+        <w:rPr>
+          <w:rStyle w:val="VerbatimChar"/>
+        </w:rPr>
+        <w:t xml:space="preserve">briefing_language</w:t>
+      </w:r>
+      <w:r>
+        <w:t xml:space="preserve">; at</w:t>
+      </w:r>
+      <w:r>
+        <w:t xml:space="preserve"> </w:t>
+      </w:r>
+      <w:r>
+        <w:rPr>
+          <w:bCs/>
+          <w:b/>
+        </w:rPr>
+        <w:t xml:space="preserve">login</w:t>
+      </w:r>
+      <w:r>
+        <w:t xml:space="preserve"> </w:t>
+      </w:r>
+      <w:r>
+        <w:t xml:space="preserve">it sets the landing locale;</w:t>
+      </w:r>
+      <w:r>
+        <w:t xml:space="preserve"> </w:t>
+      </w:r>
+      <w:r>
+        <w:rPr>
+          <w:bCs/>
+          <w:b/>
+        </w:rPr>
+        <w:t xml:space="preserve">changing it in Settings</w:t>
+      </w:r>
+      <w:r>
+        <w:t xml:space="preserve"> </w:t>
+      </w:r>
+      <w:r>
+        <w:t xml:space="preserve">switches the UI only and deliberately leaves</w:t>
+      </w:r>
+      <w:r>
+        <w:t xml:space="preserve"> </w:t>
+      </w:r>
+      <w:r>
+        <w:rPr>
+          <w:rStyle w:val="VerbatimChar"/>
+        </w:rPr>
+        <w:t xml:space="preserve">briefing_language</w:t>
+      </w:r>
+      <w:r>
+        <w:t xml:space="preserve"> </w:t>
+      </w:r>
+      <w:r>
+        <w:t xml:space="preserve">alone (English UI + Spanish guest drafts is a real case).</w:t>
+      </w:r>
+      <w:r>
+        <w:t xml:space="preserve"> </w:t>
+      </w:r>
+      <w:r>
+        <w:rPr>
+          <w:bCs/>
+          <w:b/>
+        </w:rPr>
+        <w:t xml:space="preserve">Two founder actions before it’s live:</w:t>
+      </w:r>
+      <w:r>
+        <w:t xml:space="preserve"> </w:t>
+      </w:r>
+      <w:r>
+        <w:t xml:space="preserve">(1) run</w:t>
+      </w:r>
+      <w:r>
+        <w:t xml:space="preserve"> </w:t>
+      </w:r>
+      <w:r>
+        <w:rPr>
+          <w:rStyle w:val="VerbatimChar"/>
+        </w:rPr>
+        <w:t xml:space="preserve">supabase/APPLY_0020.sql</w:t>
+      </w:r>
+      <w:r>
+        <w:t xml:space="preserve"> </w:t>
+      </w:r>
+      <w:r>
+        <w:t xml:space="preserve">in the Supabase SQL Editor</w:t>
+      </w:r>
+      <w:r>
+        <w:t xml:space="preserve"> </w:t>
+      </w:r>
+      <w:r>
+        <w:rPr>
+          <w:bCs/>
+          <w:b/>
+        </w:rPr>
+        <w:t xml:space="preserve">before</w:t>
+      </w:r>
+      <w:r>
+        <w:t xml:space="preserve"> </w:t>
+      </w:r>
+      <w:r>
+        <w:t xml:space="preserve">the code deploys — the new code calls</w:t>
+      </w:r>
+      <w:r>
+        <w:t xml:space="preserve"> </w:t>
+      </w:r>
+      <w:r>
+        <w:rPr>
+          <w:rStyle w:val="VerbatimChar"/>
+        </w:rPr>
+        <w:t xml:space="preserve">provision_hotel</w:t>
+      </w:r>
+      <w:r>
+        <w:t xml:space="preserve"> </w:t>
+      </w:r>
+      <w:r>
+        <w:t xml:space="preserve">with a locale the DB doesn’t accept until then, so onboarding breaks if code lands first; (2) commit + push + deploy (part of the same un-deployed tree as #6). Then verify the save sticks with no refresh and a fresh signup asks for language.</w:t>
+      </w:r>
+    </w:p>
+    <w:p>
+      <w:pPr>
+        <w:pStyle w:val="BodyText"/>
       </w:pPr>
       <w:r>
         <w:rPr>
@@ -6896,7 +7137,53 @@
         <w:t xml:space="preserve"> </w:t>
       </w:r>
       <w:r>
-        <w:t xml:space="preserve">is missing migration 0011, so a from-scratch rebuild would silently lack the hotel profile. Bites the first day you spin up a second environment — a scaling moment.</w:t>
+        <w:t xml:space="preserve">(the</w:t>
+      </w:r>
+      <w:r>
+        <w:t xml:space="preserve"> </w:t>
+      </w:r>
+      <w:r>
+        <w:t xml:space="preserve">“</w:t>
+      </w:r>
+      <w:r>
+        <w:t xml:space="preserve">blueprint</w:t>
+      </w:r>
+      <w:r>
+        <w:t xml:space="preserve">”</w:t>
+      </w:r>
+      <w:r>
+        <w:t xml:space="preserve"> </w:t>
+      </w:r>
+      <w:r>
+        <w:t xml:space="preserve">meant to rebuild the whole database from empty) has drifted — as of 28 Aug it’s missing migrations</w:t>
+      </w:r>
+      <w:r>
+        <w:t xml:space="preserve"> </w:t>
+      </w:r>
+      <w:r>
+        <w:rPr>
+          <w:bCs/>
+          <w:b/>
+        </w:rPr>
+        <w:t xml:space="preserve">0011, 0015, 0017, 0018, 0019 and 0020</w:t>
+      </w:r>
+      <w:r>
+        <w:t xml:space="preserve">, so a from-scratch rebuild would silently produce a broken database.</w:t>
+      </w:r>
+      <w:r>
+        <w:t xml:space="preserve"> </w:t>
+      </w:r>
+      <w:r>
+        <w:rPr>
+          <w:rStyle w:val="VerbatimChar"/>
+        </w:rPr>
+        <w:t xml:space="preserve">verify_schema.sql</w:t>
+      </w:r>
+      <w:r>
+        <w:t xml:space="preserve"> </w:t>
+      </w:r>
+      <w:r>
+        <w:t xml:space="preserve">lists exactly which. Bites the first day you spin up a second environment — a scaling moment.</w:t>
       </w:r>
     </w:p>
     <w:p>
@@ -6907,25 +7194,34 @@
         <w:rPr>
           <w:rStyle w:val="VerbatimChar"/>
         </w:rPr>
-        <w:t xml:space="preserve">Task — fix the from-scratch rebuild risk. Add migration 0011 (the 18-column</w:t>
-      </w:r>
-      <w:r>
-        <w:br/>
-      </w:r>
-      <w:r>
-        <w:rPr>
-          <w:rStyle w:val="VerbatimChar"/>
-        </w:rPr>
-        <w:t xml:space="preserve">hotel profile) to supabase/schema.sql so a rebuild from scratch includes it;</w:t>
-      </w:r>
-      <w:r>
-        <w:br/>
-      </w:r>
-      <w:r>
-        <w:rPr>
-          <w:rStyle w:val="VerbatimChar"/>
-        </w:rPr>
-        <w:t xml:space="preserve">verify schema.sql + verify_schema.sql match the live database. Correct the stale</w:t>
+        <w:t xml:space="preserve">Task — catch up supabase/schema.sql so it can rebuild a current database from</w:t>
+      </w:r>
+      <w:r>
+        <w:br/>
+      </w:r>
+      <w:r>
+        <w:rPr>
+          <w:rStyle w:val="VerbatimChar"/>
+        </w:rPr>
+        <w:t xml:space="preserve">scratch. Run verify_schema.sql to list what's missing, then fold migrations 0011,</w:t>
+      </w:r>
+      <w:r>
+        <w:br/>
+      </w:r>
+      <w:r>
+        <w:rPr>
+          <w:rStyle w:val="VerbatimChar"/>
+        </w:rPr>
+        <w:t xml:space="preserve">0015, 0017, 0018, 0019 and 0020 into schema.sql in order, matching the live database</w:t>
+      </w:r>
+      <w:r>
+        <w:br/>
+      </w:r>
+      <w:r>
+        <w:rPr>
+          <w:rStyle w:val="VerbatimChar"/>
+        </w:rPr>
+        <w:t xml:space="preserve">exactly (blueprint file only — do NOT change production). Also correct the stale</w:t>
       </w:r>
       <w:r>
         <w:br/>
@@ -6943,7 +7239,7 @@
         <w:rPr>
           <w:rStyle w:val="VerbatimChar"/>
         </w:rPr>
-        <w:t xml:space="preserve">No production change (columns already live).</w:t>
+        <w:t xml:space="preserve">Run npm run lint.</w:t>
       </w:r>
     </w:p>
     <w:p>

</xml_diff>

<commit_message>
feat(site): v3 positioning, band reorder, proof windows, sample-hotel fixture
Phases 0 through D-fix of SITE_REDESIGN_V3.md, plus the nav reorg work
already in the tree. Includes migration 0021 (newsletter_subscribers.source,
hotel_name), already applied to the live project.

Co-Authored-By: Claude Opus 5 <noreply@anthropic.com>
Claude-Session: https://claude.ai/code/session_01Rthf487jbkCWBwC5Vuxcxd
</commit_message>
<xml_diff>
--- a/FEATURE_GAPS.docx
+++ b/FEATURE_GAPS.docx
@@ -796,7 +796,7 @@
               <w:jc w:val="left"/>
             </w:pPr>
             <w:r>
-              <w:t xml:space="preserve">🔴 open</w:t>
+              <w:t xml:space="preserve">🟢 verified 28 Aug — forwards to fondasai1@gmail.com, test email landed</w:t>
             </w:r>
           </w:p>
         </w:tc>
@@ -9583,84 +9583,52 @@
               <w:jc w:val="left"/>
             </w:pPr>
             <w:r>
-              <w:rPr>
-                <w:rStyle w:val="VerbatimChar"/>
-              </w:rPr>
-              <w:t xml:space="preserve">hello@</w:t>
-            </w:r>
-            <w:r>
-              <w:t xml:space="preserve"> </w:t>
-            </w:r>
-            <w:r>
-              <w:t xml:space="preserve">inbox (in setup), reliability log (#8); optional polish: N5/N7 Settings + sync, N2 ETA loop, N3 brief-now, #10 palette</w:t>
-            </w:r>
-          </w:p>
-        </w:tc>
-        <w:tc>
-          <w:tcPr/>
-          <w:p>
-            <w:pPr>
-              <w:pStyle w:val="Compact"/>
-              <w:jc w:val="left"/>
-            </w:pPr>
-            <w:r>
-              <w:t xml:space="preserve">brief email palette</w:t>
-            </w:r>
-            <w:r>
-              <w:t xml:space="preserve"> </w:t>
-            </w:r>
+              <w:t xml:space="preserve">reliability log (#8, calendar-bound — runs in background); optional polish: N7 Settings reorg (deploying), N2 ETA loop, N3 brief-now, #10 palette</w:t>
+            </w:r>
+          </w:p>
+        </w:tc>
+        <w:tc>
+          <w:tcPr/>
+          <w:p>
+            <w:pPr>
+              <w:pStyle w:val="Compact"/>
+              <w:jc w:val="left"/>
+            </w:pPr>
             <w:r>
               <w:rPr>
                 <w:iCs/>
                 <w:i/>
               </w:rPr>
-              <w:t xml:space="preserve">(mobile, onboarding, Spanish-brief, #6 analytics, #3 website, #7 data-honesty + EU-region, N1 language,</w:t>
-            </w:r>
-            <w:r>
-              <w:rPr>
-                <w:iCs/>
-                <w:i/>
-              </w:rPr>
+              <w:t xml:space="preserve">(all pilot-blockers cleared)</w:t>
+            </w:r>
+            <w:r>
               <w:t xml:space="preserve"> </w:t>
             </w:r>
             <w:r>
-              <w:rPr>
-                <w:bCs/>
-                <w:b/>
-                <w:iCs/>
-                <w:i/>
-              </w:rPr>
-              <w:t xml:space="preserve">#5 Apaleo E2E</w:t>
-            </w:r>
-            <w:r>
-              <w:rPr>
-                <w:iCs/>
-                <w:i/>
-              </w:rPr>
+              <w:t xml:space="preserve">mobile, onboarding, Spanish-brief, #6 analytics, #3 website, #7 data-honesty + EU-region, N1 language,</w:t>
+            </w:r>
+            <w:r>
               <w:t xml:space="preserve"> </w:t>
             </w:r>
-            <w:r>
-              <w:rPr>
-                <w:iCs/>
-                <w:i/>
-              </w:rPr>
-              <w:t xml:space="preserve">✅ done 27–28 Aug)</w:t>
-            </w:r>
-          </w:p>
-        </w:tc>
-        <w:tc>
-          <w:tcPr/>
-          <w:p>
-            <w:pPr>
-              <w:pStyle w:val="Compact"/>
-              <w:jc w:val="left"/>
-            </w:pPr>
             <w:r>
               <w:rPr>
                 <w:bCs/>
                 <w:b/>
               </w:rPr>
-              <w:t xml:space="preserve">Down to two founder tasks: the</w:t>
+              <w:t xml:space="preserve">#5 Apaleo E2E</w:t>
+            </w:r>
+            <w:r>
+              <w:t xml:space="preserve">,</w:t>
+            </w:r>
+            <w:r>
+              <w:t xml:space="preserve"> </w:t>
+            </w:r>
+            <w:r>
+              <w:rPr>
+                <w:bCs/>
+                <w:b/>
+              </w:rPr>
+              <w:t xml:space="preserve">#4</w:t>
             </w:r>
             <w:r>
               <w:rPr>
@@ -9689,7 +9657,50 @@
                 <w:bCs/>
                 <w:b/>
               </w:rPr>
-              <w:t xml:space="preserve">test email and the reliability-log backfill.</w:t>
+              <w:t xml:space="preserve">inbox</w:t>
+            </w:r>
+            <w:r>
+              <w:t xml:space="preserve"> </w:t>
+            </w:r>
+            <w:r>
+              <w:t xml:space="preserve">✅</w:t>
+            </w:r>
+          </w:p>
+        </w:tc>
+        <w:tc>
+          <w:tcPr/>
+          <w:p>
+            <w:pPr>
+              <w:pStyle w:val="Compact"/>
+              <w:jc w:val="left"/>
+            </w:pPr>
+            <w:r>
+              <w:rPr>
+                <w:bCs/>
+                <w:b/>
+              </w:rPr>
+              <w:t xml:space="preserve">Last true pre-outreach blocker (</w:t>
+            </w:r>
+            <w:r>
+              <w:rPr>
+                <w:rStyle w:val="VerbatimChar"/>
+                <w:bCs/>
+                <w:b/>
+              </w:rPr>
+              <w:t xml:space="preserve">hello@</w:t>
+            </w:r>
+            <w:r>
+              <w:rPr>
+                <w:bCs/>
+                <w:b/>
+              </w:rPr>
+              <w:t xml:space="preserve">) cleared → clear to start go-to-market.</w:t>
+            </w:r>
+            <w:r>
+              <w:t xml:space="preserve"> </w:t>
+            </w:r>
+            <w:r>
+              <w:t xml:space="preserve">Reliability log accrues in parallel.</w:t>
             </w:r>
           </w:p>
         </w:tc>

</xml_diff>